<commit_message>
Add visualizations to paper, commands.txt, update notebooks
</commit_message>
<xml_diff>
--- a/Traffic_Congestion_Paper.docx
+++ b/Traffic_Congestion_Paper.docx
@@ -261,6 +261,57 @@
     </w:p>
     <w:p>
       <w:pPr>
+        <w:jc w:val="center"/>
+      </w:pPr>
+      <w:r>
+        <w:drawing>
+          <wp:inline xmlns:a="http://schemas.openxmlformats.org/drawingml/2006/main" xmlns:pic="http://schemas.openxmlformats.org/drawingml/2006/picture">
+            <wp:extent cx="5486400" cy="2743200"/>
+            <wp:docPr id="11" name="Picture 11"/>
+            <wp:cNvGraphicFramePr>
+              <a:graphicFrameLocks noChangeAspect="1"/>
+            </wp:cNvGraphicFramePr>
+            <a:graphic>
+              <a:graphicData uri="http://schemas.openxmlformats.org/drawingml/2006/picture">
+                <pic:pic>
+                  <pic:nvPicPr>
+                    <pic:cNvPr id="0" name="speed_deviation_histogram.png"/>
+                    <pic:cNvPicPr/>
+                  </pic:nvPicPr>
+                  <pic:blipFill>
+                    <a:blip r:embed="rId19"/>
+                    <a:stretch>
+                      <a:fillRect/>
+                    </a:stretch>
+                  </pic:blipFill>
+                  <pic:spPr>
+                    <a:xfrm>
+                      <a:off x="0" y="0"/>
+                      <a:ext cx="5486400" cy="2743200"/>
+                    </a:xfrm>
+                    <a:prstGeom prst="rect"/>
+                  </pic:spPr>
+                </pic:pic>
+              </a:graphicData>
+            </a:graphic>
+          </wp:inline>
+        </w:drawing>
+      </w:r>
+    </w:p>
+    <w:p>
+      <w:pPr>
+        <w:jc w:val="center"/>
+      </w:pPr>
+      <w:r>
+        <w:rPr>
+          <w:i/>
+          <w:sz w:val="20"/>
+        </w:rPr>
+        <w:t>Figure 1. Distribution of the speed-deviation feature across all zone-hour observations. The distribution is approximately symmetric around zero with heavy negative tails corresponding to congested zone-hour pairs.</w:t>
+      </w:r>
+    </w:p>
+    <w:p>
+      <w:pPr>
         <w:spacing w:after="120"/>
         <w:ind w:firstLine="360"/>
         <w:jc w:val="both"/>
@@ -345,6 +396,57 @@
     </w:p>
     <w:p>
       <w:pPr>
+        <w:jc w:val="center"/>
+      </w:pPr>
+      <w:r>
+        <w:drawing>
+          <wp:inline xmlns:a="http://schemas.openxmlformats.org/drawingml/2006/main" xmlns:pic="http://schemas.openxmlformats.org/drawingml/2006/picture">
+            <wp:extent cx="5029200" cy="3352800"/>
+            <wp:docPr id="10" name="Picture 10"/>
+            <wp:cNvGraphicFramePr>
+              <a:graphicFrameLocks noChangeAspect="1"/>
+            </wp:cNvGraphicFramePr>
+            <a:graphic>
+              <a:graphicData uri="http://schemas.openxmlformats.org/drawingml/2006/picture">
+                <pic:pic>
+                  <pic:nvPicPr>
+                    <pic:cNvPr id="0" name="speed_deviation_scatter.png"/>
+                    <pic:cNvPicPr/>
+                  </pic:nvPicPr>
+                  <pic:blipFill>
+                    <a:blip r:embed="rId18"/>
+                    <a:stretch>
+                      <a:fillRect/>
+                    </a:stretch>
+                  </pic:blipFill>
+                  <pic:spPr>
+                    <a:xfrm>
+                      <a:off x="0" y="0"/>
+                      <a:ext cx="5029200" cy="3352800"/>
+                    </a:xfrm>
+                    <a:prstGeom prst="rect"/>
+                  </pic:spPr>
+                </pic:pic>
+              </a:graphicData>
+            </a:graphic>
+          </wp:inline>
+        </w:drawing>
+      </w:r>
+    </w:p>
+    <w:p>
+      <w:pPr>
+        <w:jc w:val="center"/>
+      </w:pPr>
+      <w:r>
+        <w:rPr>
+          <w:i/>
+          <w:sz w:val="20"/>
+        </w:rPr>
+        <w:t>Figure 2. Speed deviation versus log trip density, coloured by recovered cluster. The negative-deviation, high-density region in the lower right is occupied principally by the Severe cluster.</w:t>
+      </w:r>
+    </w:p>
+    <w:p>
+      <w:pPr>
         <w:pStyle w:val="Heading2"/>
       </w:pPr>
       <w:r>
@@ -425,6 +527,108 @@
           <w:sz w:val="22"/>
         </w:rPr>
         <w:t>We perform a sweep over k ∈ {2, 3, …, 10}, fitting K-Means with k-means++ initialisation at each value and recording inertia, silhouette coefficient, Davies–Bouldin index, and Calinski–Harabasz index. The elbow of the inertia curve is identified using the kneedle algorithm; in the absence of the kneed library, a second-derivative argmax is used as a deterministic fallback. On the present data, both methods select k = 4, in agreement with the local maximum of the silhouette curve. Following selection, clusters are assigned semantic labels (Low, Moderate, High, Severe) by sorting in decreasing order of mean speed, ensuring that semantic labels are stable across runs even when raw cluster identifiers are not.</w:t>
+      </w:r>
+    </w:p>
+    <w:p>
+      <w:pPr>
+        <w:jc w:val="center"/>
+      </w:pPr>
+      <w:r>
+        <w:drawing>
+          <wp:inline xmlns:a="http://schemas.openxmlformats.org/drawingml/2006/main" xmlns:pic="http://schemas.openxmlformats.org/drawingml/2006/picture">
+            <wp:extent cx="5486400" cy="3086100"/>
+            <wp:docPr id="8" name="Picture 8"/>
+            <wp:cNvGraphicFramePr>
+              <a:graphicFrameLocks noChangeAspect="1"/>
+            </wp:cNvGraphicFramePr>
+            <a:graphic>
+              <a:graphicData uri="http://schemas.openxmlformats.org/drawingml/2006/picture">
+                <pic:pic>
+                  <pic:nvPicPr>
+                    <pic:cNvPr id="0" name="elbow_curve.png"/>
+                    <pic:cNvPicPr/>
+                  </pic:nvPicPr>
+                  <pic:blipFill>
+                    <a:blip r:embed="rId16"/>
+                    <a:stretch>
+                      <a:fillRect/>
+                    </a:stretch>
+                  </pic:blipFill>
+                  <pic:spPr>
+                    <a:xfrm>
+                      <a:off x="0" y="0"/>
+                      <a:ext cx="5486400" cy="3086100"/>
+                    </a:xfrm>
+                    <a:prstGeom prst="rect"/>
+                  </pic:spPr>
+                </pic:pic>
+              </a:graphicData>
+            </a:graphic>
+          </wp:inline>
+        </w:drawing>
+      </w:r>
+    </w:p>
+    <w:p>
+      <w:pPr>
+        <w:jc w:val="center"/>
+      </w:pPr>
+      <w:r>
+        <w:rPr>
+          <w:i/>
+          <w:sz w:val="20"/>
+        </w:rPr>
+        <w:t>Figure 3. Inertia versus number of clusters k. The kneedle algorithm and the second-derivative fallback both identify k = 4 as the elbow.</w:t>
+      </w:r>
+    </w:p>
+    <w:p>
+      <w:pPr>
+        <w:jc w:val="center"/>
+      </w:pPr>
+      <w:r>
+        <w:drawing>
+          <wp:inline xmlns:a="http://schemas.openxmlformats.org/drawingml/2006/main" xmlns:pic="http://schemas.openxmlformats.org/drawingml/2006/picture">
+            <wp:extent cx="5486400" cy="2743200"/>
+            <wp:docPr id="9" name="Picture 9"/>
+            <wp:cNvGraphicFramePr>
+              <a:graphicFrameLocks noChangeAspect="1"/>
+            </wp:cNvGraphicFramePr>
+            <a:graphic>
+              <a:graphicData uri="http://schemas.openxmlformats.org/drawingml/2006/picture">
+                <pic:pic>
+                  <pic:nvPicPr>
+                    <pic:cNvPr id="0" name="model_selection.png"/>
+                    <pic:cNvPicPr/>
+                  </pic:nvPicPr>
+                  <pic:blipFill>
+                    <a:blip r:embed="rId17"/>
+                    <a:stretch>
+                      <a:fillRect/>
+                    </a:stretch>
+                  </pic:blipFill>
+                  <pic:spPr>
+                    <a:xfrm>
+                      <a:off x="0" y="0"/>
+                      <a:ext cx="5486400" cy="2743200"/>
+                    </a:xfrm>
+                    <a:prstGeom prst="rect"/>
+                  </pic:spPr>
+                </pic:pic>
+              </a:graphicData>
+            </a:graphic>
+          </wp:inline>
+        </w:drawing>
+      </w:r>
+    </w:p>
+    <w:p>
+      <w:pPr>
+        <w:jc w:val="center"/>
+      </w:pPr>
+      <w:r>
+        <w:rPr>
+          <w:i/>
+          <w:sz w:val="20"/>
+        </w:rPr>
+        <w:t>Figure 4. Joint model-selection sweep: inertia and silhouette as functions of k. The silhouette local maximum coincides with the inertia elbow at k = 4.</w:t>
       </w:r>
     </w:p>
     <w:p>
@@ -778,6 +982,57 @@
         <w:t>Table 1. Cluster-quality metrics for the recovered four-cluster partition.</w:t>
       </w:r>
     </w:p>
+    <w:p>
+      <w:pPr>
+        <w:jc w:val="center"/>
+      </w:pPr>
+      <w:r>
+        <w:drawing>
+          <wp:inline xmlns:a="http://schemas.openxmlformats.org/drawingml/2006/main" xmlns:pic="http://schemas.openxmlformats.org/drawingml/2006/picture">
+            <wp:extent cx="5486400" cy="2743200"/>
+            <wp:docPr id="7" name="Picture 7"/>
+            <wp:cNvGraphicFramePr>
+              <a:graphicFrameLocks noChangeAspect="1"/>
+            </wp:cNvGraphicFramePr>
+            <a:graphic>
+              <a:graphicData uri="http://schemas.openxmlformats.org/drawingml/2006/picture">
+                <pic:pic>
+                  <pic:nvPicPr>
+                    <pic:cNvPr id="0" name="cluster_profile.png"/>
+                    <pic:cNvPicPr/>
+                  </pic:nvPicPr>
+                  <pic:blipFill>
+                    <a:blip r:embed="rId15"/>
+                    <a:stretch>
+                      <a:fillRect/>
+                    </a:stretch>
+                  </pic:blipFill>
+                  <pic:spPr>
+                    <a:xfrm>
+                      <a:off x="0" y="0"/>
+                      <a:ext cx="5486400" cy="2743200"/>
+                    </a:xfrm>
+                    <a:prstGeom prst="rect"/>
+                  </pic:spPr>
+                </pic:pic>
+              </a:graphicData>
+            </a:graphic>
+          </wp:inline>
+        </w:drawing>
+      </w:r>
+    </w:p>
+    <w:p>
+      <w:pPr>
+        <w:jc w:val="center"/>
+      </w:pPr>
+      <w:r>
+        <w:rPr>
+          <w:i/>
+          <w:sz w:val="20"/>
+        </w:rPr>
+        <w:t>Figure 5. Per-cluster mean profiles across the clustering features. The Severe cluster (rightmost) exhibits the most negative speed deviation and the highest log trip density.</w:t>
+      </w:r>
+    </w:p>
     <w:p/>
     <w:p>
       <w:pPr>
@@ -793,6 +1048,108 @@
           <w:sz w:val="22"/>
         </w:rPr>
         <w:t>The four recovered clusters admit interpretation as distinct congestion regimes. Cluster 0 (Low) corresponds to off-peak hours in residential and outer-borough zones, characterised by speeds at or above the zone baseline and modest trip density. Cluster 1 (Moderate) captures overnight Manhattan traffic and weekend mid-day activity in the central business district, with speed deviation near zero and elevated density. Cluster 2 (High) corresponds to the morning and evening peak footprint across midtown and downtown Manhattan, downtown Brooklyn, and the major bridge approaches, with negative speed deviation and high density. Cluster 3 (Severe) is concentrated in the central Manhattan grid between 14th and 59th Streets during the weekday evening peak, exhibiting speed deviations beyond −8 mph and trip density in the upper percentile of the dataset.</w:t>
+      </w:r>
+    </w:p>
+    <w:p>
+      <w:pPr>
+        <w:jc w:val="center"/>
+      </w:pPr>
+      <w:r>
+        <w:drawing>
+          <wp:inline xmlns:a="http://schemas.openxmlformats.org/drawingml/2006/main" xmlns:pic="http://schemas.openxmlformats.org/drawingml/2006/picture">
+            <wp:extent cx="4572000" cy="3048000"/>
+            <wp:docPr id="5" name="Picture 5"/>
+            <wp:cNvGraphicFramePr>
+              <a:graphicFrameLocks noChangeAspect="1"/>
+            </wp:cNvGraphicFramePr>
+            <a:graphic>
+              <a:graphicData uri="http://schemas.openxmlformats.org/drawingml/2006/picture">
+                <pic:pic>
+                  <pic:nvPicPr>
+                    <pic:cNvPr id="0" name="cluster_distribution.png"/>
+                    <pic:cNvPicPr/>
+                  </pic:nvPicPr>
+                  <pic:blipFill>
+                    <a:blip r:embed="rId13"/>
+                    <a:stretch>
+                      <a:fillRect/>
+                    </a:stretch>
+                  </pic:blipFill>
+                  <pic:spPr>
+                    <a:xfrm>
+                      <a:off x="0" y="0"/>
+                      <a:ext cx="4572000" cy="3048000"/>
+                    </a:xfrm>
+                    <a:prstGeom prst="rect"/>
+                  </pic:spPr>
+                </pic:pic>
+              </a:graphicData>
+            </a:graphic>
+          </wp:inline>
+        </w:drawing>
+      </w:r>
+    </w:p>
+    <w:p>
+      <w:pPr>
+        <w:jc w:val="center"/>
+      </w:pPr>
+      <w:r>
+        <w:rPr>
+          <w:i/>
+          <w:sz w:val="20"/>
+        </w:rPr>
+        <w:t>Figure 6. Distribution of zone-hour observations across the four congestion clusters.</w:t>
+      </w:r>
+    </w:p>
+    <w:p>
+      <w:pPr>
+        <w:jc w:val="center"/>
+      </w:pPr>
+      <w:r>
+        <w:drawing>
+          <wp:inline xmlns:a="http://schemas.openxmlformats.org/drawingml/2006/main" xmlns:pic="http://schemas.openxmlformats.org/drawingml/2006/picture">
+            <wp:extent cx="4572000" cy="4572000"/>
+            <wp:docPr id="6" name="Picture 6"/>
+            <wp:cNvGraphicFramePr>
+              <a:graphicFrameLocks noChangeAspect="1"/>
+            </wp:cNvGraphicFramePr>
+            <a:graphic>
+              <a:graphicData uri="http://schemas.openxmlformats.org/drawingml/2006/picture">
+                <pic:pic>
+                  <pic:nvPicPr>
+                    <pic:cNvPr id="0" name="top_congested_zones.png"/>
+                    <pic:cNvPicPr/>
+                  </pic:nvPicPr>
+                  <pic:blipFill>
+                    <a:blip r:embed="rId14"/>
+                    <a:stretch>
+                      <a:fillRect/>
+                    </a:stretch>
+                  </pic:blipFill>
+                  <pic:spPr>
+                    <a:xfrm>
+                      <a:off x="0" y="0"/>
+                      <a:ext cx="4572000" cy="4572000"/>
+                    </a:xfrm>
+                    <a:prstGeom prst="rect"/>
+                  </pic:spPr>
+                </pic:pic>
+              </a:graphicData>
+            </a:graphic>
+          </wp:inline>
+        </w:drawing>
+      </w:r>
+    </w:p>
+    <w:p>
+      <w:pPr>
+        <w:jc w:val="center"/>
+      </w:pPr>
+      <w:r>
+        <w:rPr>
+          <w:i/>
+          <w:sz w:val="20"/>
+        </w:rPr>
+        <w:t>Figure 7. Top fifteen most-congested zones ranked by mean negative speed deviation across the analysis window.</w:t>
       </w:r>
     </w:p>
     <w:p>
@@ -813,6 +1170,108 @@
     </w:p>
     <w:p>
       <w:pPr>
+        <w:jc w:val="center"/>
+      </w:pPr>
+      <w:r>
+        <w:drawing>
+          <wp:inline xmlns:a="http://schemas.openxmlformats.org/drawingml/2006/main" xmlns:pic="http://schemas.openxmlformats.org/drawingml/2006/picture">
+            <wp:extent cx="5486400" cy="3448594"/>
+            <wp:docPr id="3" name="Picture 3"/>
+            <wp:cNvGraphicFramePr>
+              <a:graphicFrameLocks noChangeAspect="1"/>
+            </wp:cNvGraphicFramePr>
+            <a:graphic>
+              <a:graphicData uri="http://schemas.openxmlformats.org/drawingml/2006/picture">
+                <pic:pic>
+                  <pic:nvPicPr>
+                    <pic:cNvPr id="0" name="zone_hour_heatmap.png"/>
+                    <pic:cNvPicPr/>
+                  </pic:nvPicPr>
+                  <pic:blipFill>
+                    <a:blip r:embed="rId11"/>
+                    <a:stretch>
+                      <a:fillRect/>
+                    </a:stretch>
+                  </pic:blipFill>
+                  <pic:spPr>
+                    <a:xfrm>
+                      <a:off x="0" y="0"/>
+                      <a:ext cx="5486400" cy="3448594"/>
+                    </a:xfrm>
+                    <a:prstGeom prst="rect"/>
+                  </pic:spPr>
+                </pic:pic>
+              </a:graphicData>
+            </a:graphic>
+          </wp:inline>
+        </w:drawing>
+      </w:r>
+    </w:p>
+    <w:p>
+      <w:pPr>
+        <w:jc w:val="center"/>
+      </w:pPr>
+      <w:r>
+        <w:rPr>
+          <w:i/>
+          <w:sz w:val="20"/>
+        </w:rPr>
+        <w:t>Figure 8. Zone-by-hour heatmap of mean speed deviation. Dark cells indicate zone-hour pairs slower than the zone baseline.</w:t>
+      </w:r>
+    </w:p>
+    <w:p>
+      <w:pPr>
+        <w:jc w:val="center"/>
+      </w:pPr>
+      <w:r>
+        <w:drawing>
+          <wp:inline xmlns:a="http://schemas.openxmlformats.org/drawingml/2006/main" xmlns:pic="http://schemas.openxmlformats.org/drawingml/2006/picture">
+            <wp:extent cx="5486400" cy="1959429"/>
+            <wp:docPr id="4" name="Picture 4"/>
+            <wp:cNvGraphicFramePr>
+              <a:graphicFrameLocks noChangeAspect="1"/>
+            </wp:cNvGraphicFramePr>
+            <a:graphic>
+              <a:graphicData uri="http://schemas.openxmlformats.org/drawingml/2006/picture">
+                <pic:pic>
+                  <pic:nvPicPr>
+                    <pic:cNvPr id="0" name="congestion_heatmap.png"/>
+                    <pic:cNvPicPr/>
+                  </pic:nvPicPr>
+                  <pic:blipFill>
+                    <a:blip r:embed="rId12"/>
+                    <a:stretch>
+                      <a:fillRect/>
+                    </a:stretch>
+                  </pic:blipFill>
+                  <pic:spPr>
+                    <a:xfrm>
+                      <a:off x="0" y="0"/>
+                      <a:ext cx="5486400" cy="1959429"/>
+                    </a:xfrm>
+                    <a:prstGeom prst="rect"/>
+                  </pic:spPr>
+                </pic:pic>
+              </a:graphicData>
+            </a:graphic>
+          </wp:inline>
+        </w:drawing>
+      </w:r>
+    </w:p>
+    <w:p>
+      <w:pPr>
+        <w:jc w:val="center"/>
+      </w:pPr>
+      <w:r>
+        <w:rPr>
+          <w:i/>
+          <w:sz w:val="20"/>
+        </w:rPr>
+        <w:t>Figure 9. Hour-of-day by day-type heatmap of congestion intensity, showing the weekday morning and evening peaks and the weekend mid-day shoulder.</w:t>
+      </w:r>
+    </w:p>
+    <w:p>
+      <w:pPr>
         <w:spacing w:after="120"/>
         <w:ind w:firstLine="360"/>
         <w:jc w:val="both"/>
@@ -825,6 +1284,108 @@
           <w:sz w:val="22"/>
         </w:rPr>
         <w:t>Performance characteristics of the system, measured on a 2021 M1-class laptop, are as follows. End-to-end pipeline execution on the six-month dataset completes in approximately four minutes and forty seconds, with the preprocessing stage accounting for the majority of the runtime. The Streamlit dashboard renders filter changes within 110 to 180 milliseconds at the 95th percentile, comfortably below the 500 millisecond target specified in the requirements. Cold-start time for the dashboard is approximately 1.2 seconds once the parquet cache is warmed.</w:t>
+      </w:r>
+    </w:p>
+    <w:p>
+      <w:pPr>
+        <w:jc w:val="center"/>
+      </w:pPr>
+      <w:r>
+        <w:drawing>
+          <wp:inline xmlns:a="http://schemas.openxmlformats.org/drawingml/2006/main" xmlns:pic="http://schemas.openxmlformats.org/drawingml/2006/picture">
+            <wp:extent cx="5486400" cy="2743200"/>
+            <wp:docPr id="1" name="Picture 1"/>
+            <wp:cNvGraphicFramePr>
+              <a:graphicFrameLocks noChangeAspect="1"/>
+            </wp:cNvGraphicFramePr>
+            <a:graphic>
+              <a:graphicData uri="http://schemas.openxmlformats.org/drawingml/2006/picture">
+                <pic:pic>
+                  <pic:nvPicPr>
+                    <pic:cNvPr id="0" name="speed_density_by_hour.png"/>
+                    <pic:cNvPicPr/>
+                  </pic:nvPicPr>
+                  <pic:blipFill>
+                    <a:blip r:embed="rId9"/>
+                    <a:stretch>
+                      <a:fillRect/>
+                    </a:stretch>
+                  </pic:blipFill>
+                  <pic:spPr>
+                    <a:xfrm>
+                      <a:off x="0" y="0"/>
+                      <a:ext cx="5486400" cy="2743200"/>
+                    </a:xfrm>
+                    <a:prstGeom prst="rect"/>
+                  </pic:spPr>
+                </pic:pic>
+              </a:graphicData>
+            </a:graphic>
+          </wp:inline>
+        </w:drawing>
+      </w:r>
+    </w:p>
+    <w:p>
+      <w:pPr>
+        <w:jc w:val="center"/>
+      </w:pPr>
+      <w:r>
+        <w:rPr>
+          <w:i/>
+          <w:sz w:val="20"/>
+        </w:rPr>
+        <w:t>Figure 10. Average speed and trip density by hour of day. The morning peak (07:00-09:00) and evening peak (16:00-19:00) coincide with the steepest reductions in average speed.</w:t>
+      </w:r>
+    </w:p>
+    <w:p>
+      <w:pPr>
+        <w:jc w:val="center"/>
+      </w:pPr>
+      <w:r>
+        <w:drawing>
+          <wp:inline xmlns:a="http://schemas.openxmlformats.org/drawingml/2006/main" xmlns:pic="http://schemas.openxmlformats.org/drawingml/2006/picture">
+            <wp:extent cx="5486400" cy="2743200"/>
+            <wp:docPr id="2" name="Picture 2"/>
+            <wp:cNvGraphicFramePr>
+              <a:graphicFrameLocks noChangeAspect="1"/>
+            </wp:cNvGraphicFramePr>
+            <a:graphic>
+              <a:graphicData uri="http://schemas.openxmlformats.org/drawingml/2006/picture">
+                <pic:pic>
+                  <pic:nvPicPr>
+                    <pic:cNvPr id="0" name="monthly_trend.png"/>
+                    <pic:cNvPicPr/>
+                  </pic:nvPicPr>
+                  <pic:blipFill>
+                    <a:blip r:embed="rId10"/>
+                    <a:stretch>
+                      <a:fillRect/>
+                    </a:stretch>
+                  </pic:blipFill>
+                  <pic:spPr>
+                    <a:xfrm>
+                      <a:off x="0" y="0"/>
+                      <a:ext cx="5486400" cy="2743200"/>
+                    </a:xfrm>
+                    <a:prstGeom prst="rect"/>
+                  </pic:spPr>
+                </pic:pic>
+              </a:graphicData>
+            </a:graphic>
+          </wp:inline>
+        </w:drawing>
+      </w:r>
+    </w:p>
+    <w:p>
+      <w:pPr>
+        <w:jc w:val="center"/>
+      </w:pPr>
+      <w:r>
+        <w:rPr>
+          <w:i/>
+          <w:sz w:val="20"/>
+        </w:rPr>
+        <w:t>Figure 11. Monthly trend of mean speed and mean trip density across the January-June 2023 analysis window.</w:t>
       </w:r>
     </w:p>
     <w:p>

</xml_diff>